<commit_message>
Tina Parte 1: revisão
Co-Authored-By: Claude Opus 5.5 <noreply@anthropic.com>
Claude-Session: https://claude.ai/code/session_01MJjUEEZrxQDEUifKK2vj9g
</commit_message>
<xml_diff>
--- a/roteiros/tina-turner/Tina_Parte1.docx
+++ b/roteiros/tina-turner/Tina_Parte1.docx
@@ -151,7 +151,7 @@
         <w:rPr>
           <w:color w:val="000000"/>
         </w:rPr>
-        <w:t>Só que, dentro de casa, a vida dela estava prestes a desmoronar.</w:t>
+        <w:t>Só que a família dela estava prestes a desmoronar.</w:t>
       </w:r>
     </w:p>
     <w:p>
@@ -159,7 +159,7 @@
         <w:rPr>
           <w:color w:val="C00000"/>
         </w:rPr>
-        <w:t>Guarde o que vem agora. Porque o que aconteceu dentro daquela casa, quando Anna Mae tinha onze anos, é exatamente o que ia se repetir com ela anos depois. Só que, da segunda vez, de um jeito muito mais brutal.</w:t>
+        <w:t>Guarde o que vem agora. Porque o que aconteceu com a família dela, quando Anna Mae tinha onze anos, é exatamente o que ia se repetir com ela anos depois. Só que, da segunda vez, de um jeito muito mais brutal.</w:t>
       </w:r>
     </w:p>
     <w:p>
@@ -263,7 +263,7 @@
         <w:rPr>
           <w:color w:val="000000"/>
         </w:rPr>
-        <w:t>Na casa da avó, Anna Mae encontrou o único lugar onde se sentia protegida.</w:t>
+        <w:t>Na casa da avó, Anna Mae encontrou um pouco de paz.</w:t>
       </w:r>
     </w:p>
     <w:p>

</xml_diff>